<commit_message>
v1.154.237: docs(iiif): podcast script - convert Demo 5 (enrichment) to a spoken roadmap beat (no annotations exist in-system yet); director notes point Demos 1-2 at the e2e-verified /iiif-viewer surface
</commit_message>
<xml_diff>
--- a/docs/IIIF-Podcast-Script.docx
+++ b/docs/IIIF-Podcast-Script.docx
@@ -798,7 +798,7 @@
           <w:iCs/>
           <w:i/>
         </w:rPr>
-        <w:t xml:space="preserve">[SCREEN: open the same record showing AI-generated annotations already applied]</w:t>
+        <w:t xml:space="preserve">[SCREEN: stay on the Mirador comparison from Segment 4, or cut back to hosts on camera. This is a spoken beat - no live annotation demo.]</w:t>
       </w:r>
     </w:p>
     <w:p>
@@ -834,19 +834,25 @@
         <w:t xml:space="preserve"> </w:t>
       </w:r>
       <w:r>
-        <w:t xml:space="preserve">This is my favourite part. Because IIIF gives us one standard surface for the image, we can layer intelligence on top of it. Look here.</w:t>
-      </w:r>
-    </w:p>
-    <w:p>
-      <w:pPr>
-        <w:pStyle w:val="BodyText"/>
-      </w:pPr>
-      <w:r>
-        <w:rPr>
-          <w:iCs/>
-          <w:i/>
-        </w:rPr>
-        <w:t xml:space="preserve">[CLICK: reveal annotation layer / hover an annotation pin.]</w:t>
+        <w:t xml:space="preserve">This is the part I'm most excited about, and it falls straight out of everything we've just shown. Because IIIF gives us one standard surface for the image, we can layer intelligence on top of it.</w:t>
+      </w:r>
+    </w:p>
+    <w:p>
+      <w:pPr>
+        <w:pStyle w:val="BodyText"/>
+      </w:pPr>
+      <w:r>
+        <w:rPr>
+          <w:bCs/>
+          <w:b/>
+        </w:rPr>
+        <w:t xml:space="preserve">HOST:</w:t>
+      </w:r>
+      <w:r>
+        <w:t xml:space="preserve"> </w:t>
+      </w:r>
+      <w:r>
+        <w:t xml:space="preserve">Meaning what, concretely?</w:t>
       </w:r>
     </w:p>
     <w:p>
@@ -864,7 +870,7 @@
         <w:t xml:space="preserve"> </w:t>
       </w:r>
       <w:r>
-        <w:t xml:space="preserve">The system has read this plate. It's pulled out text, it's identified the place, it's tagged the people and the event. And it can translate that. And every one of those findings is pinned as an annotation, right on the spot in the image it refers to.</w:t>
+        <w:t xml:space="preserve">Picture this plate again. An AI reads it - pulls out the text, identifies the place, tags the people and the event, even translates it. And here's the key: each of those findings gets pinned as an annotation, right on the spot in the image it refers to. Not in a separate spreadsheet. On the picture.</w:t>
       </w:r>
     </w:p>
     <w:p>
@@ -882,7 +888,7 @@
         <w:t xml:space="preserve"> </w:t>
       </w:r>
       <w:r>
-        <w:t xml:space="preserve">So the collection is describing itself.</w:t>
+        <w:t xml:space="preserve">So the collection starts describing itself.</w:t>
       </w:r>
     </w:p>
     <w:p>
@@ -900,7 +906,7 @@
         <w:t xml:space="preserve"> </w:t>
       </w:r>
       <w:r>
-        <w:t xml:space="preserve">The collection starts describing itself. And critically, those annotations are themselves a standard. They're not locked inside Heratio. Another IIIF viewer, anywhere, can read them too.</w:t>
+        <w:t xml:space="preserve">That's exactly the direction. And critically, those annotations are themselves a standard - the same W3C annotation model every IIIF viewer understands. They're not locked inside Heratio. Another institution's viewer could read them too.</w:t>
       </w:r>
     </w:p>
     <w:p>
@@ -936,7 +942,7 @@
         <w:t xml:space="preserve"> </w:t>
       </w:r>
       <w:r>
-        <w:t xml:space="preserve">Every archive's is. This doesn't replace the archivist. It gives the archivist a first draft, at scale, on material that would otherwise sit undescribed forever.</w:t>
+        <w:t xml:space="preserve">Every archive's is. This doesn't replace the archivist. It gives the archivist a first draft, at scale, on material that would otherwise sit undescribed forever. That's what the standard unlocks once the image is open.</w:t>
       </w:r>
     </w:p>
     <w:p>
@@ -1260,23 +1266,68 @@
         <w:t xml:space="preserve"> </w:t>
       </w:r>
       <w:r>
-        <w:t xml:space="preserve">both viewers (open once so tiles cache) and</w:t>
-      </w:r>
-      <w:r>
-        <w:t xml:space="preserve"> </w:t>
-      </w:r>
-      <w:r>
-        <w:rPr>
-          <w:bCs/>
-          <w:b/>
-        </w:rPr>
-        <w:t xml:space="preserve">pre-run</w:t>
-      </w:r>
-      <w:r>
-        <w:t xml:space="preserve"> </w:t>
-      </w:r>
-      <w:r>
-        <w:t xml:space="preserve">the annotations so Segment 5 is instant. Never run AI live on camera.</w:t>
+        <w:t xml:space="preserve">the viewer (open</w:t>
+      </w:r>
+      <w:r>
+        <w:t xml:space="preserve"> </w:t>
+      </w:r>
+      <w:r>
+        <w:rPr>
+          <w:rStyle w:val="VerbatimChar"/>
+        </w:rPr>
+        <w:t xml:space="preserve">/iiif-viewer/flowers-in-the-garden</w:t>
+      </w:r>
+      <w:r>
+        <w:t xml:space="preserve"> </w:t>
+      </w:r>
+      <w:r>
+        <w:t xml:space="preserve">once so tiles cache before recording). Segment 5 is a spoken beat now - no annotation demo, nothing to pre-run. There are currently no annotations in the system, so do not attempt to show one live; keep it forward-looking ("that's the direction").</w:t>
+      </w:r>
+    </w:p>
+    <w:p>
+      <w:pPr>
+        <w:numPr>
+          <w:ilvl w:val="0"/>
+          <w:numId w:val="1001"/>
+        </w:numPr>
+        <w:pStyle w:val="Compact"/>
+      </w:pPr>
+      <w:r>
+        <w:rPr>
+          <w:bCs/>
+          <w:b/>
+        </w:rPr>
+        <w:t xml:space="preserve">Use the dedicated viewer</w:t>
+      </w:r>
+      <w:r>
+        <w:t xml:space="preserve"> </w:t>
+      </w:r>
+      <w:r>
+        <w:rPr>
+          <w:rStyle w:val="VerbatimChar"/>
+        </w:rPr>
+        <w:t xml:space="preserve">/iiif-viewer/flowers-in-the-garden</w:t>
+      </w:r>
+      <w:r>
+        <w:t xml:space="preserve"> </w:t>
+      </w:r>
+      <w:r>
+        <w:t xml:space="preserve">for Demos 1 and 2 - verified end-to-end by</w:t>
+      </w:r>
+      <w:r>
+        <w:t xml:space="preserve"> </w:t>
+      </w:r>
+      <w:r>
+        <w:rPr>
+          <w:rStyle w:val="VerbatimChar"/>
+        </w:rPr>
+        <w:t xml:space="preserve">tests/e2e/07-iiif-demo.spec.js</w:t>
+      </w:r>
+      <w:r>
+        <w:t xml:space="preserve"> </w:t>
+      </w:r>
+      <w:r>
+        <w:t xml:space="preserve">(deep-zoom paints, external IA manifest loads). Avoid relying on the annotation layer on camera.</w:t>
       </w:r>
     </w:p>
     <w:p>

</xml_diff>